<commit_message>
Frame family story as lessons from three years ago in final demo materials
</commit_message>
<xml_diff>
--- a/submission/PathwayAI_Demo_Script_and_10_QA.docx
+++ b/submission/PathwayAI_Demo_Script_and_10_QA.docx
@@ -43,137 +43,97 @@
     </w:p>
     <w:p>
       <w:r>
-        <w:t>Then it became personal. [pause]</w:t>
+        <w:t>Then, three years ago, it became personal. [pause]</w:t>
       </w:r>
     </w:p>
     <w:p>
       <w:r>
-        <w:t>I lost my job, and my family lost our health insurance. The next month, my husband was bitten by a tick and developed Lyme disease. [short pause]</w:t>
+        <w:t>I lost my job, and my family lost our health insurance. The next month, my husband was bitten by a tick and developed Lyme disease.</w:t>
       </w:r>
     </w:p>
     <w:p>
       <w:r>
-        <w:t>For my husband, speaking to a doctor in English could feel overwhelming. I wanted to make that first conversation easier. [short pause]</w:t>
+        <w:t>That experience taught me how difficult it can be to navigate care while worrying about costs—and how language can make those conversations even harder. [short pause]</w:t>
       </w:r>
     </w:p>
     <w:p>
       <w:r>
-        <w:t>I’m Yuwei Zhang. That experience led me to build PathwayAI. [pause]</w:t>
+        <w:t>I kept thinking: how could we help other families feel better prepared?</w:t>
       </w:r>
     </w:p>
     <w:p>
       <w:r>
-        <w:t>Illness brings more than symptoms. It brings questions.</w:t>
+        <w:t>I’m Yuwei Zhang. Those lessons led me to build PathwayAI. [pause]</w:t>
       </w:r>
     </w:p>
     <w:p>
       <w:r>
-        <w:t>Where do we go for care? What will it cost? How do we explain what has happened? [short pause]</w:t>
+        <w:t>Illness costs more than a medical bill. There is time spent finding care, missed work, and help from family.</w:t>
       </w:r>
     </w:p>
     <w:p>
       <w:r>
-        <w:t>For some immigrants and people who feel less comfortable using English, those questions can be harder to answer. Medical words, unfamiliar tests, and confusing bills can make an already difficult situation more stressful. [short pause]</w:t>
+        <w:t>PathwayAI connects practical patient support with public evidence for community planning. [short pause]</w:t>
       </w:r>
     </w:p>
     <w:p>
       <w:r>
-        <w:t>PathwayAI connects practical help for patients with public evidence for community planning. Let me show you what that means. [pause]</w:t>
+        <w:t>[warm] First, what does a patient gain?</w:t>
       </w:r>
     </w:p>
     <w:p>
       <w:r>
-        <w:t>[warm] First, what can it do for a patient?</w:t>
+        <w:t>Start in Care and Support. Someone without insurance can find community health centers and questions about income-based fees, coverage, and hospital financial assistance. Care is not automatically free, but they have somewhere to start.</w:t>
       </w:r>
     </w:p>
     <w:p>
       <w:r>
-        <w:t>In Care and Support, someone without insurance can find community health centers and questions to ask about income-based fees, coverage, and hospital financial assistance.</w:t>
+        <w:t>Support also begins before illness. In Learn and Prevent, enter a destination ZIP code, month, and outdoor activity. Download a practical tick-prevention plan.</w:t>
       </w:r>
     </w:p>
     <w:p>
       <w:r>
-        <w:t>Care is not automatically free. But people have somewhere to start—and questions they can use when they call. [short pause]</w:t>
+        <w:t>On Tick Bite: What Next, find removal instructions, what to record, and when to contact a clinician. Some bites require time-sensitive advice. [short pause]</w:t>
       </w:r>
     </w:p>
     <w:p>
       <w:r>
-        <w:t>Preparation also begins before illness.</w:t>
+        <w:t>Early, appropriate treatment can help prevent more severe Lyme disease. Addressing barriers to care is part of addressing the burden. [pause]</w:t>
       </w:r>
     </w:p>
     <w:p>
       <w:r>
-        <w:t>In Learn and Prevent, enter a destination ZIP code, month, and outdoor activity. Download a plan with practical tick-prevention steps.</w:t>
+        <w:t>[explaining] Now imagine someone preparing for a visit. All patient details in this demonstration are fictional.</w:t>
       </w:r>
     </w:p>
     <w:p>
       <w:r>
-        <w:t>If someone finds an attached tick, Tick Bite: What Next explains removal, what to record, and when to contact a clinician. Some bites require time-sensitive advice. [short pause]</w:t>
+        <w:t>They record exposure, symptoms, tests, and care, then review and correct a timeline. Symptom onset and diagnosis delay stay separate. Original test reports still matter.</w:t>
       </w:r>
     </w:p>
     <w:p>
       <w:r>
-        <w:t>Early, appropriate treatment can help prevent more severe Lyme disease. Helping people overcome barriers to reaching care is part of addressing the burden. [pause]</w:t>
+        <w:t>People can write in their preferred language or mix languages. With permission, optional external AI helps prepare an English summary alongside the original for review.</w:t>
       </w:r>
     </w:p>
     <w:p>
       <w:r>
-        <w:t>[explaining] Now imagine someone preparing for a medical visit. Every patient detail in this demonstration is fictional.</w:t>
+        <w:t>The goal is to help people feel better prepared to explain symptoms and ask questions, so language is less of a barrier to seeking care. It does not replace a qualified medical interpreter. [short pause]</w:t>
       </w:r>
     </w:p>
     <w:p>
       <w:r>
-        <w:t>They enter where they were, when symptoms began, and what tests or care they received. The organizer helps put that information into a timeline they can review and correct.</w:t>
+        <w:t>We have invited Mandarin-, Spanish-, and English-speaking reviewers to test whether instructions are clear and summaries preserve their meaning. That testing is ongoing.</w:t>
       </w:r>
     </w:p>
     <w:p>
       <w:r>
-        <w:t>Symptom onset and diagnosis delay stay separate. Original test reports still matter. [short pause]</w:t>
+        <w:t>The English organizer also works without external AI. That is the option shown here. Select Download my visit summary to save the reviewed note. [pause]</w:t>
       </w:r>
     </w:p>
     <w:p>
       <w:r>
-        <w:t>People can write in the language they feel most comfortable using. They can also mix languages—keeping a place name or medical word in English.</w:t>
-      </w:r>
-    </w:p>
-    <w:p>
-      <w:r>
-        <w:t>With permission, optional external AI helps prepare an English summary alongside the original for review. It does not diagnose illness or replace a qualified medical interpreter.</w:t>
-      </w:r>
-    </w:p>
-    <w:p>
-      <w:r>
-        <w:t>The purpose is simple: help someone arrive better prepared to explain symptoms and ask questions, so language is less of a barrier to seeking care. [short pause]</w:t>
-      </w:r>
-    </w:p>
-    <w:p>
-      <w:r>
-        <w:t>We have invited people who use Mandarin, Spanish, and English to test the experience. We want to learn whether the instructions are understandable and the summaries preserve what people actually meant. This testing is ongoing. [short pause]</w:t>
-      </w:r>
-    </w:p>
-    <w:p>
-      <w:r>
-        <w:t>The English organizer also works without external AI. That is the option shown here.</w:t>
-      </w:r>
-    </w:p>
-    <w:p>
-      <w:r>
-        <w:t>Choose Download my visit summary, and take the reviewed note to the appointment. [pause]</w:t>
-      </w:r>
-    </w:p>
-    <w:p>
-      <w:r>
-        <w:t>[serious] What about costs?</w:t>
-      </w:r>
-    </w:p>
-    <w:p>
-      <w:r>
-        <w:t>Adding numbers alone will not pay a bill.</w:t>
-      </w:r>
-    </w:p>
-    <w:p>
-      <w:r>
-        <w:t>But keeping expenses, missed work, and unpaid family help together can make those concerns easier to explain when asking for support.</w:t>
+        <w:t>[serious] What about costs? Adding numbers alone will not pay a bill.</w:t>
       </w:r>
     </w:p>
     <w:p>
@@ -183,72 +143,67 @@
     </w:p>
     <w:p>
       <w:r>
-        <w:t>The app keeps money, workdays, and caregiving hours separate. The appointment and cost summary can be downloaded, while the care-access checklist provides questions for a clinic or billing office. [pause]</w:t>
+        <w:t>Money, workdays, and caregiving hours stay separate. The benefit is keeping these concerns together when asking for support.</w:t>
       </w:r>
     </w:p>
     <w:p>
       <w:r>
-        <w:t>[curious] How does this help a community?</w:t>
+        <w:t>Download the appointment and cost summary. The care-access checklist provides questions for a clinic or billing office. [pause]</w:t>
       </w:r>
     </w:p>
     <w:p>
       <w:r>
-        <w:t>A county team faces a different question: where should we focus limited resources?</w:t>
+        <w:t>[curious] Second, what does a community gain?</w:t>
       </w:r>
     </w:p>
     <w:p>
       <w:r>
-        <w:t>In Community Burden and Action, PathwayAI brings together sources that answer different parts of that question.</w:t>
+        <w:t>County teams need to decide where to focus limited resources. Community Burden and Action brings together evidence for that conversation.</w:t>
       </w:r>
     </w:p>
     <w:p>
       <w:r>
-        <w:t>New York surveillance provides reported Lyme cases and rates. Census data adds population and language context. HRSA describes healthcare resources. CDC PLACES provides broader community-health estimates. CMS adds separate Original Medicare spending context—not Lyme-specific costs. [short pause]</w:t>
+        <w:t>New York surveillance provides reported Lyme cases and rates. Census data adds population and language context. HRSA describes healthcare resources. CDC tick surveillance informs exposure context, while CDC PLACES adds broader community-health estimates. CMS provides separate Original Medicare spending context—not Lyme-specific costs.</w:t>
       </w:r>
     </w:p>
     <w:p>
       <w:r>
-        <w:t>The county cost illustration multiplies 2024 reported cases by a published societal-cost benchmark expressed in 2016 dollars. The source, calculation, and dollar year remain visible.</w:t>
+        <w:t>The county illustration multiplies 2024 reported cases by a published societal-cost benchmark in 2016 dollars. Sources and calculations stay visible. This is an illustration, not measured county spending. [pause]</w:t>
       </w:r>
     </w:p>
     <w:p>
       <w:r>
-        <w:t>It illustrates burden. It is not measured county spending. [pause]</w:t>
+        <w:t>[explaining] The planning brief connects a need with possible actions, partners, and measures: prevention outreach, clinic navigation, or connections to language and transportation support.</w:t>
       </w:r>
     </w:p>
     <w:p>
       <w:r>
-        <w:t>[explaining] The planning brief then connects a need with a possible action.</w:t>
+        <w:t>Partners would confirm capacity and resources. A pilot could track completed referrals, appointments reached, assistance received, and unmet needs. [short pause]</w:t>
       </w:r>
     </w:p>
     <w:p>
       <w:r>
-        <w:t>That might mean prevention education in parks, connecting uninsured residents with existing clinics, or working with partners on language and transportation support.</w:t>
+        <w:t>Third, how do these connect?</w:t>
       </w:r>
     </w:p>
     <w:p>
       <w:r>
-        <w:t>A pilot could track completed referrals, appointments reached, assistance received, and needs still unmet. [short pause]</w:t>
+        <w:t>County averages cannot explain why one family struggled to reach care. Patient experiences reveal questions worth investigating. Public data provides context for a focused response.</w:t>
       </w:r>
     </w:p>
     <w:p>
       <w:r>
-        <w:t>County averages cannot explain why one family struggled to reach care. Patient experiences can reveal questions worth investigating. Public data helps put those questions in context.</w:t>
+        <w:t>Personal notes are not automatically sent to counties. Secure, consent-based reporting is a future goal. [pause]</w:t>
       </w:r>
     </w:p>
     <w:p>
       <w:r>
-        <w:t>Personal notes are not automatically sent to counties. Secure, consent-based community reporting is a future development goal. [pause]</w:t>
+        <w:t>[hopeful] People living with Lyme disease and a county health commissioner reviewed the working app. Their feedback helped us simplify choices and clarify next steps.</w:t>
       </w:r>
     </w:p>
     <w:p>
       <w:r>
-        <w:t>[hopeful] People living with Lyme disease and a county health commissioner reviewed the working app. Their feedback helped us simplify choices and clarify practical next steps.</w:t>
-      </w:r>
-    </w:p>
-    <w:p>
-      <w:r>
-        <w:t>We are seeking patient groups, health centers, and community partners for a small pilot. We will test usefulness before claiming better outcomes or savings. [short pause]</w:t>
+        <w:t>We welcome patient groups, health centers, and community partners for a small pilot. We will evaluate usefulness before claiming better outcomes or savings. Our proposed model keeps patient access free through grants and partnerships. [short pause]</w:t>
       </w:r>
     </w:p>
     <w:p>
@@ -263,7 +218,7 @@
     </w:p>
     <w:p>
       <w:r>
-        <w:t>[warm] Thank you to the patients, caregivers, and reviewers helping us build a more useful next step.</w:t>
+        <w:t>[warm] Thank you to the patients, caregivers, and reviewers helping shape what comes next.</w:t>
       </w:r>
     </w:p>
     <w:p>

</xml_diff>